<commit_message>
Update Exercise 2 solution file with additional steps for launching an EC2 instance
</commit_message>
<xml_diff>
--- a/Hands-on Exercises/Exercise 2/Solution File Exercise 2.docx
+++ b/Hands-on Exercises/Exercise 2/Solution File Exercise 2.docx
@@ -678,8 +678,6 @@
           </wp:inline>
         </w:drawing>
       </w:r>
-      <w:bookmarkStart w:id="0" w:name="_GoBack"/>
-      <w:bookmarkEnd w:id="0"/>
     </w:p>
     <w:p>
       <w:pPr>
@@ -714,6 +712,78 @@
           <w:szCs w:val="28"/>
         </w:rPr>
         <w:t>s, allow SSH traffic from My IP:</w:t>
+      </w:r>
+    </w:p>
+    <w:p>
+      <w:pPr>
+        <w:spacing w:before="100" w:after="60"/>
+        <w:rPr>
+          <w:rFonts w:asciiTheme="majorHAnsi" w:eastAsiaTheme="majorEastAsia" w:hAnsiTheme="majorHAnsi" w:cstheme="majorBidi"/>
+          <w:b/>
+          <w:bCs/>
+          <w:color w:val="1F4E79"/>
+          <w:sz w:val="35"/>
+          <w:szCs w:val="28"/>
+        </w:rPr>
+      </w:pPr>
+      <w:r>
+        <w:rPr>
+          <w:rFonts w:asciiTheme="majorHAnsi" w:eastAsiaTheme="majorEastAsia" w:hAnsiTheme="majorHAnsi" w:cstheme="majorBidi"/>
+          <w:b/>
+          <w:bCs/>
+          <w:noProof/>
+          <w:color w:val="1F4E79"/>
+          <w:sz w:val="35"/>
+          <w:szCs w:val="28"/>
+        </w:rPr>
+        <w:drawing>
+          <wp:inline distT="0" distB="0" distL="0" distR="0">
+            <wp:extent cx="6455410" cy="3984821"/>
+            <wp:effectExtent l="0" t="0" r="2540" b="0"/>
+            <wp:docPr id="10" name="Picture 10" descr="C:\Users\Khubaib\Downloads\step 8.jpg"/>
+            <wp:cNvGraphicFramePr>
+              <a:graphicFrameLocks xmlns:a="http://schemas.openxmlformats.org/drawingml/2006/main" noChangeAspect="1"/>
+            </wp:cNvGraphicFramePr>
+            <a:graphic xmlns:a="http://schemas.openxmlformats.org/drawingml/2006/main">
+              <a:graphicData uri="http://schemas.openxmlformats.org/drawingml/2006/picture">
+                <pic:pic xmlns:pic="http://schemas.openxmlformats.org/drawingml/2006/picture">
+                  <pic:nvPicPr>
+                    <pic:cNvPr id="0" name="Picture 10" descr="C:\Users\Khubaib\Downloads\step 8.jpg"/>
+                    <pic:cNvPicPr>
+                      <a:picLocks noChangeAspect="1" noChangeArrowheads="1"/>
+                    </pic:cNvPicPr>
+                  </pic:nvPicPr>
+                  <pic:blipFill>
+                    <a:blip r:embed="rId15">
+                      <a:extLst>
+                        <a:ext uri="{28A0092B-C50C-407E-A947-70E740481C1C}">
+                          <a14:useLocalDpi xmlns:a14="http://schemas.microsoft.com/office/drawing/2010/main" val="0"/>
+                        </a:ext>
+                      </a:extLst>
+                    </a:blip>
+                    <a:srcRect/>
+                    <a:stretch>
+                      <a:fillRect/>
+                    </a:stretch>
+                  </pic:blipFill>
+                  <pic:spPr bwMode="auto">
+                    <a:xfrm>
+                      <a:off x="0" y="0"/>
+                      <a:ext cx="6455410" cy="3984821"/>
+                    </a:xfrm>
+                    <a:prstGeom prst="rect">
+                      <a:avLst/>
+                    </a:prstGeom>
+                    <a:noFill/>
+                    <a:ln>
+                      <a:noFill/>
+                    </a:ln>
+                  </pic:spPr>
+                </pic:pic>
+              </a:graphicData>
+            </a:graphic>
+          </wp:inline>
+        </w:drawing>
       </w:r>
     </w:p>
     <w:p>
@@ -768,6 +838,79 @@
           <w:rFonts w:asciiTheme="majorHAnsi" w:eastAsiaTheme="majorEastAsia" w:hAnsiTheme="majorHAnsi" w:cstheme="majorBidi"/>
           <w:b/>
           <w:bCs/>
+          <w:noProof/>
+          <w:color w:val="1F4E79"/>
+          <w:sz w:val="35"/>
+          <w:szCs w:val="28"/>
+        </w:rPr>
+        <w:lastRenderedPageBreak/>
+        <w:drawing>
+          <wp:inline distT="0" distB="0" distL="0" distR="0">
+            <wp:extent cx="6455410" cy="3984821"/>
+            <wp:effectExtent l="0" t="0" r="2540" b="0"/>
+            <wp:docPr id="11" name="Picture 11" descr="C:\Users\Khubaib\Downloads\step 9.jpg"/>
+            <wp:cNvGraphicFramePr>
+              <a:graphicFrameLocks xmlns:a="http://schemas.openxmlformats.org/drawingml/2006/main" noChangeAspect="1"/>
+            </wp:cNvGraphicFramePr>
+            <a:graphic xmlns:a="http://schemas.openxmlformats.org/drawingml/2006/main">
+              <a:graphicData uri="http://schemas.openxmlformats.org/drawingml/2006/picture">
+                <pic:pic xmlns:pic="http://schemas.openxmlformats.org/drawingml/2006/picture">
+                  <pic:nvPicPr>
+                    <pic:cNvPr id="0" name="Picture 11" descr="C:\Users\Khubaib\Downloads\step 9.jpg"/>
+                    <pic:cNvPicPr>
+                      <a:picLocks noChangeAspect="1" noChangeArrowheads="1"/>
+                    </pic:cNvPicPr>
+                  </pic:nvPicPr>
+                  <pic:blipFill>
+                    <a:blip r:embed="rId16">
+                      <a:extLst>
+                        <a:ext uri="{28A0092B-C50C-407E-A947-70E740481C1C}">
+                          <a14:useLocalDpi xmlns:a14="http://schemas.microsoft.com/office/drawing/2010/main" val="0"/>
+                        </a:ext>
+                      </a:extLst>
+                    </a:blip>
+                    <a:srcRect/>
+                    <a:stretch>
+                      <a:fillRect/>
+                    </a:stretch>
+                  </pic:blipFill>
+                  <pic:spPr bwMode="auto">
+                    <a:xfrm>
+                      <a:off x="0" y="0"/>
+                      <a:ext cx="6455410" cy="3984821"/>
+                    </a:xfrm>
+                    <a:prstGeom prst="rect">
+                      <a:avLst/>
+                    </a:prstGeom>
+                    <a:noFill/>
+                    <a:ln>
+                      <a:noFill/>
+                    </a:ln>
+                  </pic:spPr>
+                </pic:pic>
+              </a:graphicData>
+            </a:graphic>
+          </wp:inline>
+        </w:drawing>
+      </w:r>
+    </w:p>
+    <w:p>
+      <w:pPr>
+        <w:spacing w:before="100" w:after="60"/>
+        <w:rPr>
+          <w:rFonts w:asciiTheme="majorHAnsi" w:eastAsiaTheme="majorEastAsia" w:hAnsiTheme="majorHAnsi" w:cstheme="majorBidi"/>
+          <w:b/>
+          <w:bCs/>
+          <w:color w:val="1F4E79"/>
+          <w:sz w:val="35"/>
+          <w:szCs w:val="28"/>
+        </w:rPr>
+      </w:pPr>
+      <w:r>
+        <w:rPr>
+          <w:rFonts w:asciiTheme="majorHAnsi" w:eastAsiaTheme="majorEastAsia" w:hAnsiTheme="majorHAnsi" w:cstheme="majorBidi"/>
+          <w:b/>
+          <w:bCs/>
           <w:color w:val="1F4E79"/>
           <w:sz w:val="35"/>
           <w:szCs w:val="28"/>
@@ -803,10 +946,85 @@
           <w:rFonts w:asciiTheme="majorHAnsi" w:eastAsiaTheme="majorEastAsia" w:hAnsiTheme="majorHAnsi" w:cstheme="majorBidi"/>
           <w:b/>
           <w:bCs/>
+          <w:noProof/>
           <w:color w:val="1F4E79"/>
           <w:sz w:val="35"/>
           <w:szCs w:val="28"/>
         </w:rPr>
+        <w:drawing>
+          <wp:inline distT="0" distB="0" distL="0" distR="0">
+            <wp:extent cx="6455410" cy="4006247"/>
+            <wp:effectExtent l="0" t="0" r="2540" b="0"/>
+            <wp:docPr id="12" name="Picture 12" descr="C:\Users\Khubaib\Downloads\step 10.png"/>
+            <wp:cNvGraphicFramePr>
+              <a:graphicFrameLocks xmlns:a="http://schemas.openxmlformats.org/drawingml/2006/main" noChangeAspect="1"/>
+            </wp:cNvGraphicFramePr>
+            <a:graphic xmlns:a="http://schemas.openxmlformats.org/drawingml/2006/main">
+              <a:graphicData uri="http://schemas.openxmlformats.org/drawingml/2006/picture">
+                <pic:pic xmlns:pic="http://schemas.openxmlformats.org/drawingml/2006/picture">
+                  <pic:nvPicPr>
+                    <pic:cNvPr id="0" name="Picture 12" descr="C:\Users\Khubaib\Downloads\step 10.png"/>
+                    <pic:cNvPicPr>
+                      <a:picLocks noChangeAspect="1" noChangeArrowheads="1"/>
+                    </pic:cNvPicPr>
+                  </pic:nvPicPr>
+                  <pic:blipFill>
+                    <a:blip r:embed="rId17">
+                      <a:extLst>
+                        <a:ext uri="{28A0092B-C50C-407E-A947-70E740481C1C}">
+                          <a14:useLocalDpi xmlns:a14="http://schemas.microsoft.com/office/drawing/2010/main" val="0"/>
+                        </a:ext>
+                      </a:extLst>
+                    </a:blip>
+                    <a:srcRect/>
+                    <a:stretch>
+                      <a:fillRect/>
+                    </a:stretch>
+                  </pic:blipFill>
+                  <pic:spPr bwMode="auto">
+                    <a:xfrm>
+                      <a:off x="0" y="0"/>
+                      <a:ext cx="6455410" cy="4006247"/>
+                    </a:xfrm>
+                    <a:prstGeom prst="rect">
+                      <a:avLst/>
+                    </a:prstGeom>
+                    <a:noFill/>
+                    <a:ln>
+                      <a:noFill/>
+                    </a:ln>
+                  </pic:spPr>
+                </pic:pic>
+              </a:graphicData>
+            </a:graphic>
+          </wp:inline>
+        </w:drawing>
+      </w:r>
+      <w:bookmarkStart w:id="0" w:name="_GoBack"/>
+      <w:bookmarkEnd w:id="0"/>
+    </w:p>
+    <w:p>
+      <w:pPr>
+        <w:spacing w:before="100" w:after="60"/>
+        <w:rPr>
+          <w:rFonts w:asciiTheme="majorHAnsi" w:eastAsiaTheme="majorEastAsia" w:hAnsiTheme="majorHAnsi" w:cstheme="majorBidi"/>
+          <w:b/>
+          <w:bCs/>
+          <w:color w:val="1F4E79"/>
+          <w:sz w:val="35"/>
+          <w:szCs w:val="28"/>
+        </w:rPr>
+      </w:pPr>
+      <w:r>
+        <w:rPr>
+          <w:rFonts w:asciiTheme="majorHAnsi" w:eastAsiaTheme="majorEastAsia" w:hAnsiTheme="majorHAnsi" w:cstheme="majorBidi"/>
+          <w:b/>
+          <w:bCs/>
+          <w:color w:val="1F4E79"/>
+          <w:sz w:val="35"/>
+          <w:szCs w:val="28"/>
+        </w:rPr>
+        <w:lastRenderedPageBreak/>
         <w:t>Wait until the instance state becomes Running and take a screenshot of the running instance</w:t>
       </w:r>
       <w:r>
@@ -822,8 +1040,8 @@
       </w:r>
     </w:p>
     <w:sectPr>
-      <w:headerReference w:type="default" r:id="rId15"/>
-      <w:footerReference w:type="default" r:id="rId16"/>
+      <w:headerReference w:type="default" r:id="rId18"/>
+      <w:footerReference w:type="default" r:id="rId19"/>
       <w:pgSz w:w="12240" w:h="15840"/>
       <w:pgMar w:top="893" w:right="1037" w:bottom="835" w:left="1037" w:header="720" w:footer="720" w:gutter="0"/>
       <w:cols w:space="720"/>
@@ -908,7 +1126,7 @@
         <w:color w:val="757575"/>
         <w:sz w:val="16"/>
       </w:rPr>
-      <w:t>5</w:t>
+      <w:t>7</w:t>
     </w:r>
     <w:r>
       <w:rPr>
@@ -12989,7 +13207,7 @@
 </file>
 
 <file path=customXml/itemProps1.xml><?xml version="1.0" encoding="utf-8"?>
-<ds:datastoreItem xmlns:ds="http://schemas.openxmlformats.org/officeDocument/2006/customXml" ds:itemID="{FD6D6DF7-04E7-47D3-A866-97BA04D4483E}">
+<ds:datastoreItem xmlns:ds="http://schemas.openxmlformats.org/officeDocument/2006/customXml" ds:itemID="{AB33FBB2-640D-41EA-A4C7-24F666FE59F4}">
   <ds:schemaRefs>
     <ds:schemaRef ds:uri="http://schemas.openxmlformats.org/officeDocument/2006/bibliography"/>
   </ds:schemaRefs>

</xml_diff>